<commit_message>
hero wording tweaks + update AAPL full report to v2
- 值得赌 → 值得下重注
- 扎实得多的生意 → 更扎实商业逻辑的生意
- AAPL_uninodue_full_report v2 替换

Co-Authored-By: Claude Opus 4.7 (1M context) <noreply@anthropic.com>
</commit_message>
<xml_diff>
--- a/AAPL_uninodue_full_report_installed.docx
+++ b/AAPL_uninodue_full_report_installed.docx
@@ -1520,7 +1520,7 @@
         <w:rPr>
           <w:rFonts w:eastAsia="Roboto"/>
         </w:rPr>
-        <w:t xml:space="preserve"> 2026-04-18, FY24 10-K, FY25 10-K synthesis, FY24 Q4 earnings call. Net-debt flag: </w:t>
+        <w:t xml:space="preserve"> 2026-04-18, FY25 10-K, FY25 Q4 earnings call, F1Q26 10-Q. Net-debt flag: </w:t>
       </w:r>
       <w:proofErr w:type="spellStart"/>
       <w:r>
@@ -4461,7 +4461,7 @@
           <w:sz w:val="24"/>
           <w:szCs w:val="24"/>
         </w:rPr>
-        <w:t>2.2 FY2024 Actuals (10-K)</w:t>
+        <w:t>2.2 FY2025 Actuals (10-K)</w:t>
       </w:r>
     </w:p>
     <w:tbl>
@@ -4547,7 +4547,7 @@
                 <w:bCs/>
                 <w:color w:val="FFFFFF"/>
               </w:rPr>
-              <w:t>FY2024 Value</w:t>
+              <w:t>FY2025 Value</w:t>
             </w:r>
           </w:p>
         </w:tc>
@@ -4636,32 +4636,32 @@
               <w:rPr>
                 <w:rFonts w:eastAsia="Roboto"/>
               </w:rPr>
-              <w:t>$391.04B</w:t>
-            </w:r>
-          </w:p>
-        </w:tc>
-        <w:tc>
-          <w:tcPr>
-            <w:tcW w:w="0" w:type="auto"/>
-            <w:tcBorders>
-              <w:top w:val="none" w:sz="0" w:space="0" w:color="FFFFFF"/>
-              <w:left w:val="none" w:sz="0" w:space="0" w:color="FFFFFF"/>
-              <w:bottom w:val="single" w:sz="4" w:space="0" w:color="D9DEE3"/>
-              <w:right w:val="none" w:sz="0" w:space="0" w:color="FFFFFF"/>
-            </w:tcBorders>
-            <w:tcMar>
-              <w:top w:w="86" w:type="dxa"/>
-              <w:left w:w="64" w:type="dxa"/>
-              <w:bottom w:w="86" w:type="dxa"/>
-              <w:right w:w="64" w:type="dxa"/>
-            </w:tcMar>
-          </w:tcPr>
-          <w:p>
-            <w:r>
-              <w:rPr>
-                <w:rFonts w:eastAsia="Roboto"/>
-              </w:rPr>
-              <w:t>+2% YoY (vs FY23 $383.3B)</w:t>
+              <w:t>$416.16B</w:t>
+            </w:r>
+          </w:p>
+        </w:tc>
+        <w:tc>
+          <w:tcPr>
+            <w:tcW w:w="0" w:type="auto"/>
+            <w:tcBorders>
+              <w:top w:val="none" w:sz="0" w:space="0" w:color="FFFFFF"/>
+              <w:left w:val="none" w:sz="0" w:space="0" w:color="FFFFFF"/>
+              <w:bottom w:val="single" w:sz="4" w:space="0" w:color="D9DEE3"/>
+              <w:right w:val="none" w:sz="0" w:space="0" w:color="FFFFFF"/>
+            </w:tcBorders>
+            <w:tcMar>
+              <w:top w:w="86" w:type="dxa"/>
+              <w:left w:w="64" w:type="dxa"/>
+              <w:bottom w:w="86" w:type="dxa"/>
+              <w:right w:w="64" w:type="dxa"/>
+            </w:tcMar>
+          </w:tcPr>
+          <w:p>
+            <w:r>
+              <w:rPr>
+                <w:rFonts w:eastAsia="Roboto"/>
+              </w:rPr>
+              <w:t>+6.4% YoY (vs FY24 $391.0B)</w:t>
             </w:r>
           </w:p>
         </w:tc>
@@ -4721,32 +4721,32 @@
               <w:rPr>
                 <w:rFonts w:eastAsia="Roboto"/>
               </w:rPr>
-              <w:t>$96.17B</w:t>
-            </w:r>
-          </w:p>
-        </w:tc>
-        <w:tc>
-          <w:tcPr>
-            <w:tcW w:w="0" w:type="auto"/>
-            <w:tcBorders>
-              <w:top w:val="none" w:sz="0" w:space="0" w:color="FFFFFF"/>
-              <w:left w:val="none" w:sz="0" w:space="0" w:color="FFFFFF"/>
-              <w:bottom w:val="single" w:sz="4" w:space="0" w:color="D9DEE3"/>
-              <w:right w:val="none" w:sz="0" w:space="0" w:color="FFFFFF"/>
-            </w:tcBorders>
-            <w:tcMar>
-              <w:top w:w="86" w:type="dxa"/>
-              <w:left w:w="64" w:type="dxa"/>
-              <w:bottom w:w="86" w:type="dxa"/>
-              <w:right w:w="64" w:type="dxa"/>
-            </w:tcMar>
-          </w:tcPr>
-          <w:p>
-            <w:r>
-              <w:rPr>
-                <w:rFonts w:eastAsia="Roboto"/>
-              </w:rPr>
-              <w:t>24.6% mix, +11% to +14% YoY Q-by-Q</w:t>
+              <w:t>$109.16B</w:t>
+            </w:r>
+          </w:p>
+        </w:tc>
+        <w:tc>
+          <w:tcPr>
+            <w:tcW w:w="0" w:type="auto"/>
+            <w:tcBorders>
+              <w:top w:val="none" w:sz="0" w:space="0" w:color="FFFFFF"/>
+              <w:left w:val="none" w:sz="0" w:space="0" w:color="FFFFFF"/>
+              <w:bottom w:val="single" w:sz="4" w:space="0" w:color="D9DEE3"/>
+              <w:right w:val="none" w:sz="0" w:space="0" w:color="FFFFFF"/>
+            </w:tcBorders>
+            <w:tcMar>
+              <w:top w:w="86" w:type="dxa"/>
+              <w:left w:w="64" w:type="dxa"/>
+              <w:bottom w:w="86" w:type="dxa"/>
+              <w:right w:w="64" w:type="dxa"/>
+            </w:tcMar>
+          </w:tcPr>
+          <w:p>
+            <w:r>
+              <w:rPr>
+                <w:rFonts w:eastAsia="Roboto"/>
+              </w:rPr>
+              <w:t>26.2% mix, +13.5% YoY</w:t>
             </w:r>
           </w:p>
         </w:tc>
@@ -4806,32 +4806,32 @@
               <w:rPr>
                 <w:rFonts w:eastAsia="Roboto"/>
               </w:rPr>
-              <w:t>46.2%</w:t>
-            </w:r>
-          </w:p>
-        </w:tc>
-        <w:tc>
-          <w:tcPr>
-            <w:tcW w:w="0" w:type="auto"/>
-            <w:tcBorders>
-              <w:top w:val="none" w:sz="0" w:space="0" w:color="FFFFFF"/>
-              <w:left w:val="none" w:sz="0" w:space="0" w:color="FFFFFF"/>
-              <w:bottom w:val="single" w:sz="4" w:space="0" w:color="D9DEE3"/>
-              <w:right w:val="none" w:sz="0" w:space="0" w:color="FFFFFF"/>
-            </w:tcBorders>
-            <w:tcMar>
-              <w:top w:w="86" w:type="dxa"/>
-              <w:left w:w="64" w:type="dxa"/>
-              <w:bottom w:w="86" w:type="dxa"/>
-              <w:right w:w="64" w:type="dxa"/>
-            </w:tcMar>
-          </w:tcPr>
-          <w:p>
-            <w:r>
-              <w:rPr>
-                <w:rFonts w:eastAsia="Roboto"/>
-              </w:rPr>
-              <w:t>Products 37.2% / Services 73.9%</w:t>
+              <w:t>46.9%</w:t>
+            </w:r>
+          </w:p>
+        </w:tc>
+        <w:tc>
+          <w:tcPr>
+            <w:tcW w:w="0" w:type="auto"/>
+            <w:tcBorders>
+              <w:top w:val="none" w:sz="0" w:space="0" w:color="FFFFFF"/>
+              <w:left w:val="none" w:sz="0" w:space="0" w:color="FFFFFF"/>
+              <w:bottom w:val="single" w:sz="4" w:space="0" w:color="D9DEE3"/>
+              <w:right w:val="none" w:sz="0" w:space="0" w:color="FFFFFF"/>
+            </w:tcBorders>
+            <w:tcMar>
+              <w:top w:w="86" w:type="dxa"/>
+              <w:left w:w="64" w:type="dxa"/>
+              <w:bottom w:w="86" w:type="dxa"/>
+              <w:right w:w="64" w:type="dxa"/>
+            </w:tcMar>
+          </w:tcPr>
+          <w:p>
+            <w:r>
+              <w:rPr>
+                <w:rFonts w:eastAsia="Roboto"/>
+              </w:rPr>
+              <w:t>Products 36.8% / Services 75.4%</w:t>
             </w:r>
           </w:p>
         </w:tc>
@@ -4891,32 +4891,32 @@
               <w:rPr>
                 <w:rFonts w:eastAsia="Roboto"/>
               </w:rPr>
-              <w:t>~31.5%</w:t>
-            </w:r>
-          </w:p>
-        </w:tc>
-        <w:tc>
-          <w:tcPr>
-            <w:tcW w:w="0" w:type="auto"/>
-            <w:tcBorders>
-              <w:top w:val="none" w:sz="0" w:space="0" w:color="FFFFFF"/>
-              <w:left w:val="none" w:sz="0" w:space="0" w:color="FFFFFF"/>
-              <w:bottom w:val="single" w:sz="4" w:space="0" w:color="D9DEE3"/>
-              <w:right w:val="none" w:sz="0" w:space="0" w:color="FFFFFF"/>
-            </w:tcBorders>
-            <w:tcMar>
-              <w:top w:w="86" w:type="dxa"/>
-              <w:left w:w="64" w:type="dxa"/>
-              <w:bottom w:w="86" w:type="dxa"/>
-              <w:right w:w="64" w:type="dxa"/>
-            </w:tcMar>
-          </w:tcPr>
-          <w:p>
-            <w:r>
-              <w:rPr>
-                <w:rFonts w:eastAsia="Roboto"/>
-              </w:rPr>
-              <w:t>implied from R&amp;D 8.0% + SG&amp;A 6.7%</w:t>
+              <w:t>~32.0%</w:t>
+            </w:r>
+          </w:p>
+        </w:tc>
+        <w:tc>
+          <w:tcPr>
+            <w:tcW w:w="0" w:type="auto"/>
+            <w:tcBorders>
+              <w:top w:val="none" w:sz="0" w:space="0" w:color="FFFFFF"/>
+              <w:left w:val="none" w:sz="0" w:space="0" w:color="FFFFFF"/>
+              <w:bottom w:val="single" w:sz="4" w:space="0" w:color="D9DEE3"/>
+              <w:right w:val="none" w:sz="0" w:space="0" w:color="FFFFFF"/>
+            </w:tcBorders>
+            <w:tcMar>
+              <w:top w:w="86" w:type="dxa"/>
+              <w:left w:w="64" w:type="dxa"/>
+              <w:bottom w:w="86" w:type="dxa"/>
+              <w:right w:w="64" w:type="dxa"/>
+            </w:tcMar>
+          </w:tcPr>
+          <w:p>
+            <w:r>
+              <w:rPr>
+                <w:rFonts w:eastAsia="Roboto"/>
+              </w:rPr>
+              <w:t>R&amp;D 8.3% intensity</w:t>
             </w:r>
           </w:p>
         </w:tc>
@@ -4976,32 +4976,32 @@
               <w:rPr>
                 <w:rFonts w:eastAsia="Roboto"/>
               </w:rPr>
-              <w:t>~$108.8B</w:t>
-            </w:r>
-          </w:p>
-        </w:tc>
-        <w:tc>
-          <w:tcPr>
-            <w:tcW w:w="0" w:type="auto"/>
-            <w:tcBorders>
-              <w:top w:val="none" w:sz="0" w:space="0" w:color="FFFFFF"/>
-              <w:left w:val="none" w:sz="0" w:space="0" w:color="FFFFFF"/>
-              <w:bottom w:val="single" w:sz="4" w:space="0" w:color="D9DEE3"/>
-              <w:right w:val="none" w:sz="0" w:space="0" w:color="FFFFFF"/>
-            </w:tcBorders>
-            <w:tcMar>
-              <w:top w:w="86" w:type="dxa"/>
-              <w:left w:w="64" w:type="dxa"/>
-              <w:bottom w:w="86" w:type="dxa"/>
-              <w:right w:w="64" w:type="dxa"/>
-            </w:tcMar>
-          </w:tcPr>
-          <w:p>
-            <w:r>
-              <w:rPr>
-                <w:rFonts w:eastAsia="Roboto"/>
-              </w:rPr>
-              <w:t>~27.8% of revenue</w:t>
+              <w:t>~$98.8B</w:t>
+            </w:r>
+          </w:p>
+        </w:tc>
+        <w:tc>
+          <w:tcPr>
+            <w:tcW w:w="0" w:type="auto"/>
+            <w:tcBorders>
+              <w:top w:val="none" w:sz="0" w:space="0" w:color="FFFFFF"/>
+              <w:left w:val="none" w:sz="0" w:space="0" w:color="FFFFFF"/>
+              <w:bottom w:val="single" w:sz="4" w:space="0" w:color="D9DEE3"/>
+              <w:right w:val="none" w:sz="0" w:space="0" w:color="FFFFFF"/>
+            </w:tcBorders>
+            <w:tcMar>
+              <w:top w:w="86" w:type="dxa"/>
+              <w:left w:w="64" w:type="dxa"/>
+              <w:bottom w:w="86" w:type="dxa"/>
+              <w:right w:w="64" w:type="dxa"/>
+            </w:tcMar>
+          </w:tcPr>
+          <w:p>
+            <w:r>
+              <w:rPr>
+                <w:rFonts w:eastAsia="Roboto"/>
+              </w:rPr>
+              <w:t>~23.7% of revenue</w:t>
             </w:r>
           </w:p>
         </w:tc>
@@ -5061,32 +5061,32 @@
               <w:rPr>
                 <w:rFonts w:eastAsia="Roboto"/>
               </w:rPr>
-              <w:t>$66.95B</w:t>
-            </w:r>
-          </w:p>
-        </w:tc>
-        <w:tc>
-          <w:tcPr>
-            <w:tcW w:w="0" w:type="auto"/>
-            <w:tcBorders>
-              <w:top w:val="none" w:sz="0" w:space="0" w:color="FFFFFF"/>
-              <w:left w:val="none" w:sz="0" w:space="0" w:color="FFFFFF"/>
-              <w:bottom w:val="single" w:sz="4" w:space="0" w:color="D9DEE3"/>
-              <w:right w:val="none" w:sz="0" w:space="0" w:color="FFFFFF"/>
-            </w:tcBorders>
-            <w:tcMar>
-              <w:top w:w="86" w:type="dxa"/>
-              <w:left w:w="64" w:type="dxa"/>
-              <w:bottom w:w="86" w:type="dxa"/>
-              <w:right w:w="64" w:type="dxa"/>
-            </w:tcMar>
-          </w:tcPr>
-          <w:p>
-            <w:r>
-              <w:rPr>
-                <w:rFonts w:eastAsia="Roboto"/>
-              </w:rPr>
-              <w:t>17.1% mix, -8% YoY</w:t>
+              <w:t>$64.38B</w:t>
+            </w:r>
+          </w:p>
+        </w:tc>
+        <w:tc>
+          <w:tcPr>
+            <w:tcW w:w="0" w:type="auto"/>
+            <w:tcBorders>
+              <w:top w:val="none" w:sz="0" w:space="0" w:color="FFFFFF"/>
+              <w:left w:val="none" w:sz="0" w:space="0" w:color="FFFFFF"/>
+              <w:bottom w:val="single" w:sz="4" w:space="0" w:color="D9DEE3"/>
+              <w:right w:val="none" w:sz="0" w:space="0" w:color="FFFFFF"/>
+            </w:tcBorders>
+            <w:tcMar>
+              <w:top w:w="86" w:type="dxa"/>
+              <w:left w:w="64" w:type="dxa"/>
+              <w:bottom w:w="86" w:type="dxa"/>
+              <w:right w:w="64" w:type="dxa"/>
+            </w:tcMar>
+          </w:tcPr>
+          <w:p>
+            <w:r>
+              <w:rPr>
+                <w:rFonts w:eastAsia="Roboto"/>
+              </w:rPr>
+              <w:t>15.5% mix, -3.8% YoY</w:t>
             </w:r>
           </w:p>
         </w:tc>
@@ -5146,32 +5146,32 @@
               <w:rPr>
                 <w:rFonts w:eastAsia="Roboto"/>
               </w:rPr>
-              <w:t>$167.05B</w:t>
-            </w:r>
-          </w:p>
-        </w:tc>
-        <w:tc>
-          <w:tcPr>
-            <w:tcW w:w="0" w:type="auto"/>
-            <w:tcBorders>
-              <w:top w:val="none" w:sz="0" w:space="0" w:color="FFFFFF"/>
-              <w:left w:val="none" w:sz="0" w:space="0" w:color="FFFFFF"/>
-              <w:bottom w:val="single" w:sz="4" w:space="0" w:color="D9DEE3"/>
-              <w:right w:val="none" w:sz="0" w:space="0" w:color="FFFFFF"/>
-            </w:tcBorders>
-            <w:tcMar>
-              <w:top w:w="86" w:type="dxa"/>
-              <w:left w:w="64" w:type="dxa"/>
-              <w:bottom w:w="86" w:type="dxa"/>
-              <w:right w:w="64" w:type="dxa"/>
-            </w:tcMar>
-          </w:tcPr>
-          <w:p>
-            <w:r>
-              <w:rPr>
-                <w:rFonts w:eastAsia="Roboto"/>
-              </w:rPr>
-              <w:t>42.7% mix, +3% YoY</w:t>
+              <w:t>$178.35B</w:t>
+            </w:r>
+          </w:p>
+        </w:tc>
+        <w:tc>
+          <w:tcPr>
+            <w:tcW w:w="0" w:type="auto"/>
+            <w:tcBorders>
+              <w:top w:val="none" w:sz="0" w:space="0" w:color="FFFFFF"/>
+              <w:left w:val="none" w:sz="0" w:space="0" w:color="FFFFFF"/>
+              <w:bottom w:val="single" w:sz="4" w:space="0" w:color="D9DEE3"/>
+              <w:right w:val="none" w:sz="0" w:space="0" w:color="FFFFFF"/>
+            </w:tcBorders>
+            <w:tcMar>
+              <w:top w:w="86" w:type="dxa"/>
+              <w:left w:w="64" w:type="dxa"/>
+              <w:bottom w:w="86" w:type="dxa"/>
+              <w:right w:w="64" w:type="dxa"/>
+            </w:tcMar>
+          </w:tcPr>
+          <w:p>
+            <w:r>
+              <w:rPr>
+                <w:rFonts w:eastAsia="Roboto"/>
+              </w:rPr>
+              <w:t>42.8% mix, +6.8% YoY</w:t>
             </w:r>
           </w:p>
         </w:tc>
@@ -5206,7 +5206,6 @@
                 <w:b/>
                 <w:bCs/>
               </w:rPr>
-              <w:lastRenderedPageBreak/>
               <w:t>R&amp;D / Revenue</w:t>
             </w:r>
           </w:p>
@@ -5232,32 +5231,32 @@
               <w:rPr>
                 <w:rFonts w:eastAsia="Roboto"/>
               </w:rPr>
-              <w:t>8.0%</w:t>
-            </w:r>
-          </w:p>
-        </w:tc>
-        <w:tc>
-          <w:tcPr>
-            <w:tcW w:w="0" w:type="auto"/>
-            <w:tcBorders>
-              <w:top w:val="none" w:sz="0" w:space="0" w:color="FFFFFF"/>
-              <w:left w:val="none" w:sz="0" w:space="0" w:color="FFFFFF"/>
-              <w:bottom w:val="single" w:sz="4" w:space="0" w:color="D9DEE3"/>
-              <w:right w:val="none" w:sz="0" w:space="0" w:color="FFFFFF"/>
-            </w:tcBorders>
-            <w:tcMar>
-              <w:top w:w="86" w:type="dxa"/>
-              <w:left w:w="64" w:type="dxa"/>
-              <w:bottom w:w="86" w:type="dxa"/>
-              <w:right w:w="64" w:type="dxa"/>
-            </w:tcMar>
-          </w:tcPr>
-          <w:p>
-            <w:r>
-              <w:rPr>
-                <w:rFonts w:eastAsia="Roboto"/>
-              </w:rPr>
-              <w:t>$31.37B</w:t>
+              <w:t>8.3%</w:t>
+            </w:r>
+          </w:p>
+        </w:tc>
+        <w:tc>
+          <w:tcPr>
+            <w:tcW w:w="0" w:type="auto"/>
+            <w:tcBorders>
+              <w:top w:val="none" w:sz="0" w:space="0" w:color="FFFFFF"/>
+              <w:left w:val="none" w:sz="0" w:space="0" w:color="FFFFFF"/>
+              <w:bottom w:val="single" w:sz="4" w:space="0" w:color="D9DEE3"/>
+              <w:right w:val="none" w:sz="0" w:space="0" w:color="FFFFFF"/>
+            </w:tcBorders>
+            <w:tcMar>
+              <w:top w:w="86" w:type="dxa"/>
+              <w:left w:w="64" w:type="dxa"/>
+              <w:bottom w:w="86" w:type="dxa"/>
+              <w:right w:w="64" w:type="dxa"/>
+            </w:tcMar>
+          </w:tcPr>
+          <w:p>
+            <w:r>
+              <w:rPr>
+                <w:rFonts w:eastAsia="Roboto"/>
+              </w:rPr>
+              <w:t>~$34.5B</w:t>
             </w:r>
           </w:p>
         </w:tc>
@@ -5317,32 +5316,32 @@
               <w:rPr>
                 <w:rFonts w:eastAsia="Roboto"/>
               </w:rPr>
-              <w:t>$95.85B</w:t>
-            </w:r>
-          </w:p>
-        </w:tc>
-        <w:tc>
-          <w:tcPr>
-            <w:tcW w:w="0" w:type="auto"/>
-            <w:tcBorders>
-              <w:top w:val="none" w:sz="0" w:space="0" w:color="FFFFFF"/>
-              <w:left w:val="none" w:sz="0" w:space="0" w:color="FFFFFF"/>
-              <w:bottom w:val="single" w:sz="4" w:space="0" w:color="D9DEE3"/>
-              <w:right w:val="none" w:sz="0" w:space="0" w:color="FFFFFF"/>
-            </w:tcBorders>
-            <w:tcMar>
-              <w:top w:w="86" w:type="dxa"/>
-              <w:left w:w="64" w:type="dxa"/>
-              <w:bottom w:w="86" w:type="dxa"/>
-              <w:right w:w="64" w:type="dxa"/>
-            </w:tcMar>
-          </w:tcPr>
-          <w:p>
-            <w:r>
-              <w:rPr>
-                <w:rFonts w:eastAsia="Roboto"/>
-              </w:rPr>
-              <w:t>~24% of revenue returned</w:t>
+              <w:t>$89.3B</w:t>
+            </w:r>
+          </w:p>
+        </w:tc>
+        <w:tc>
+          <w:tcPr>
+            <w:tcW w:w="0" w:type="auto"/>
+            <w:tcBorders>
+              <w:top w:val="none" w:sz="0" w:space="0" w:color="FFFFFF"/>
+              <w:left w:val="none" w:sz="0" w:space="0" w:color="FFFFFF"/>
+              <w:bottom w:val="single" w:sz="4" w:space="0" w:color="D9DEE3"/>
+              <w:right w:val="none" w:sz="0" w:space="0" w:color="FFFFFF"/>
+            </w:tcBorders>
+            <w:tcMar>
+              <w:top w:w="86" w:type="dxa"/>
+              <w:left w:w="64" w:type="dxa"/>
+              <w:bottom w:w="86" w:type="dxa"/>
+              <w:right w:w="64" w:type="dxa"/>
+            </w:tcMar>
+          </w:tcPr>
+          <w:p>
+            <w:r>
+              <w:rPr>
+                <w:rFonts w:eastAsia="Roboto"/>
+              </w:rPr>
+              <w:t>~21.5% of revenue returned</w:t>
             </w:r>
           </w:p>
         </w:tc>
@@ -5361,35 +5360,31 @@
         <w:rPr>
           <w:rFonts w:eastAsia="Roboto"/>
         </w:rPr>
-        <w:t xml:space="preserve">FY2024 was a transitional year: total revenue +2% YoY masked an iPhone rebound in the back half, Services inflecting to double-digit growth every quarter ($23.12B Q1 → $24.97B Q4), and Greater China posting its second consecutive decline year (-8%). The 46.2% consolidated GM was a record, driven entirely by Services mix; Products GM of 37.2% </w:t>
+        <w:t>FY2025 was a re-acceleration year: total revenue +6.4% YoY to $416.2B was the strongest annual growth since FY22, powered by iPhone recovering to $209.6B (+4.2% YoY), Services crossing the $100B threshold at $109.16B (+13.5% YoY with every quarter setting records), and Mac delivering its best year since the M-series transition at $33.71B (+12.4% YoY). Greater China remained a headwind at $64.38B (-3.8% YoY), but the F1Q26 +38% reversal suggests the trough has passed. Blended gross margin expanded to 46.9% (+70bps YoY), entirely driven by Services mix shift to 26.2% (up from 24.6%), while Products GM slipped 40bps to 36.8%. Net income jumped to $112.0B (+19.5% from FY24's $93.7B), as the EU State Aid one-time tax charge rolled off and ETR normalized to 15.6%.</w:t>
       </w:r>
       <w:proofErr w:type="gramStart"/>
       <w:r>
         <w:rPr>
           <w:rFonts w:eastAsia="Roboto"/>
         </w:rPr>
-        <w:t>actually compressed</w:t>
       </w:r>
       <w:proofErr w:type="gramEnd"/>
       <w:r>
         <w:rPr>
           <w:rFonts w:eastAsia="Roboto"/>
         </w:rPr>
-        <w:t xml:space="preserve"> ~200bps from peak cycle. R&amp;D intensity climbed to 8.0% ($31.37B) vs FY21's </w:t>
       </w:r>
       <w:proofErr w:type="gramStart"/>
       <w:r>
         <w:rPr>
           <w:rFonts w:eastAsia="Roboto"/>
         </w:rPr>
-        <w:t>6.0% —</w:t>
       </w:r>
       <w:proofErr w:type="gramEnd"/>
       <w:r>
         <w:rPr>
           <w:rFonts w:eastAsia="Roboto"/>
         </w:rPr>
-        <w:t xml:space="preserve"> an explicit re-investment into Apple Intelligence infrastructure and Apple Silicon roadmap that F1Q26 data shows rising further to 7.6% of single-quarter revenue.</w:t>
       </w:r>
     </w:p>
     <w:p>
@@ -5405,7 +5400,7 @@
           <w:sz w:val="24"/>
           <w:szCs w:val="24"/>
         </w:rPr>
-        <w:t>2.3 FY2024 Segment Mix</w:t>
+        <w:t>2.3 FY2025 Segment Mix</w:t>
       </w:r>
     </w:p>
     <w:tbl>
@@ -5492,7 +5487,7 @@
                 <w:bCs/>
                 <w:color w:val="FFFFFF"/>
               </w:rPr>
-              <w:t>FY24 Revenue</w:t>
+              <w:t>FY25 Revenue</w:t>
             </w:r>
           </w:p>
         </w:tc>
@@ -5550,7 +5545,7 @@
                 <w:bCs/>
                 <w:color w:val="FFFFFF"/>
               </w:rPr>
-              <w:t>FY24 YoY</w:t>
+              <w:t>FY25 YoY</w:t>
             </w:r>
           </w:p>
         </w:tc>
@@ -5610,57 +5605,57 @@
               <w:rPr>
                 <w:rFonts w:eastAsia="Roboto"/>
               </w:rPr>
-              <w:t>~$201.2B</w:t>
-            </w:r>
-          </w:p>
-        </w:tc>
-        <w:tc>
-          <w:tcPr>
-            <w:tcW w:w="0" w:type="auto"/>
-            <w:tcBorders>
-              <w:top w:val="none" w:sz="0" w:space="0" w:color="FFFFFF"/>
-              <w:left w:val="none" w:sz="0" w:space="0" w:color="FFFFFF"/>
-              <w:bottom w:val="single" w:sz="4" w:space="0" w:color="D9DEE3"/>
-              <w:right w:val="none" w:sz="0" w:space="0" w:color="FFFFFF"/>
-            </w:tcBorders>
-            <w:tcMar>
-              <w:top w:w="86" w:type="dxa"/>
-              <w:left w:w="64" w:type="dxa"/>
-              <w:bottom w:w="86" w:type="dxa"/>
-              <w:right w:w="64" w:type="dxa"/>
-            </w:tcMar>
-          </w:tcPr>
-          <w:p>
-            <w:r>
-              <w:rPr>
-                <w:rFonts w:eastAsia="Roboto"/>
-              </w:rPr>
-              <w:t>~51.5%</w:t>
-            </w:r>
-          </w:p>
-        </w:tc>
-        <w:tc>
-          <w:tcPr>
-            <w:tcW w:w="0" w:type="auto"/>
-            <w:tcBorders>
-              <w:top w:val="none" w:sz="0" w:space="0" w:color="FFFFFF"/>
-              <w:left w:val="none" w:sz="0" w:space="0" w:color="FFFFFF"/>
-              <w:bottom w:val="single" w:sz="4" w:space="0" w:color="D9DEE3"/>
-              <w:right w:val="none" w:sz="0" w:space="0" w:color="FFFFFF"/>
-            </w:tcBorders>
-            <w:tcMar>
-              <w:top w:w="86" w:type="dxa"/>
-              <w:left w:w="64" w:type="dxa"/>
-              <w:bottom w:w="86" w:type="dxa"/>
-              <w:right w:w="64" w:type="dxa"/>
-            </w:tcMar>
-          </w:tcPr>
-          <w:p>
-            <w:r>
-              <w:rPr>
-                <w:rFonts w:eastAsia="Roboto"/>
-              </w:rPr>
-              <w:t>~+0% (Q1 +6%, Q2 -10%, Q3 -1%, Q4 +6%)</w:t>
+              <w:t>$209.59B</w:t>
+            </w:r>
+          </w:p>
+        </w:tc>
+        <w:tc>
+          <w:tcPr>
+            <w:tcW w:w="0" w:type="auto"/>
+            <w:tcBorders>
+              <w:top w:val="none" w:sz="0" w:space="0" w:color="FFFFFF"/>
+              <w:left w:val="none" w:sz="0" w:space="0" w:color="FFFFFF"/>
+              <w:bottom w:val="single" w:sz="4" w:space="0" w:color="D9DEE3"/>
+              <w:right w:val="none" w:sz="0" w:space="0" w:color="FFFFFF"/>
+            </w:tcBorders>
+            <w:tcMar>
+              <w:top w:w="86" w:type="dxa"/>
+              <w:left w:w="64" w:type="dxa"/>
+              <w:bottom w:w="86" w:type="dxa"/>
+              <w:right w:w="64" w:type="dxa"/>
+            </w:tcMar>
+          </w:tcPr>
+          <w:p>
+            <w:r>
+              <w:rPr>
+                <w:rFonts w:eastAsia="Roboto"/>
+              </w:rPr>
+              <w:t>50.4%</w:t>
+            </w:r>
+          </w:p>
+        </w:tc>
+        <w:tc>
+          <w:tcPr>
+            <w:tcW w:w="0" w:type="auto"/>
+            <w:tcBorders>
+              <w:top w:val="none" w:sz="0" w:space="0" w:color="FFFFFF"/>
+              <w:left w:val="none" w:sz="0" w:space="0" w:color="FFFFFF"/>
+              <w:bottom w:val="single" w:sz="4" w:space="0" w:color="D9DEE3"/>
+              <w:right w:val="none" w:sz="0" w:space="0" w:color="FFFFFF"/>
+            </w:tcBorders>
+            <w:tcMar>
+              <w:top w:w="86" w:type="dxa"/>
+              <w:left w:w="64" w:type="dxa"/>
+              <w:bottom w:w="86" w:type="dxa"/>
+              <w:right w:w="64" w:type="dxa"/>
+            </w:tcMar>
+          </w:tcPr>
+          <w:p>
+            <w:r>
+              <w:rPr>
+                <w:rFonts w:eastAsia="Roboto"/>
+              </w:rPr>
+              <w:t>+4.2% (Pro/Pro Max mix rising)</w:t>
             </w:r>
           </w:p>
         </w:tc>
@@ -5720,57 +5715,57 @@
               <w:rPr>
                 <w:rFonts w:eastAsia="Roboto"/>
               </w:rPr>
-              <w:t>~$29.98B</w:t>
-            </w:r>
-          </w:p>
-        </w:tc>
-        <w:tc>
-          <w:tcPr>
-            <w:tcW w:w="0" w:type="auto"/>
-            <w:tcBorders>
-              <w:top w:val="none" w:sz="0" w:space="0" w:color="FFFFFF"/>
-              <w:left w:val="none" w:sz="0" w:space="0" w:color="FFFFFF"/>
-              <w:bottom w:val="single" w:sz="4" w:space="0" w:color="D9DEE3"/>
-              <w:right w:val="none" w:sz="0" w:space="0" w:color="FFFFFF"/>
-            </w:tcBorders>
-            <w:tcMar>
-              <w:top w:w="86" w:type="dxa"/>
-              <w:left w:w="64" w:type="dxa"/>
-              <w:bottom w:w="86" w:type="dxa"/>
-              <w:right w:w="64" w:type="dxa"/>
-            </w:tcMar>
-          </w:tcPr>
-          <w:p>
-            <w:r>
-              <w:rPr>
-                <w:rFonts w:eastAsia="Roboto"/>
-              </w:rPr>
-              <w:t>~7.7%</w:t>
-            </w:r>
-          </w:p>
-        </w:tc>
-        <w:tc>
-          <w:tcPr>
-            <w:tcW w:w="0" w:type="auto"/>
-            <w:tcBorders>
-              <w:top w:val="none" w:sz="0" w:space="0" w:color="FFFFFF"/>
-              <w:left w:val="none" w:sz="0" w:space="0" w:color="FFFFFF"/>
-              <w:bottom w:val="single" w:sz="4" w:space="0" w:color="D9DEE3"/>
-              <w:right w:val="none" w:sz="0" w:space="0" w:color="FFFFFF"/>
-            </w:tcBorders>
-            <w:tcMar>
-              <w:top w:w="86" w:type="dxa"/>
-              <w:left w:w="64" w:type="dxa"/>
-              <w:bottom w:w="86" w:type="dxa"/>
-              <w:right w:w="64" w:type="dxa"/>
-            </w:tcMar>
-          </w:tcPr>
-          <w:p>
-            <w:r>
-              <w:rPr>
-                <w:rFonts w:eastAsia="Roboto"/>
-              </w:rPr>
-              <w:t>~+2% (M-series refresh tailwind)</w:t>
+              <w:t>$33.71B</w:t>
+            </w:r>
+          </w:p>
+        </w:tc>
+        <w:tc>
+          <w:tcPr>
+            <w:tcW w:w="0" w:type="auto"/>
+            <w:tcBorders>
+              <w:top w:val="none" w:sz="0" w:space="0" w:color="FFFFFF"/>
+              <w:left w:val="none" w:sz="0" w:space="0" w:color="FFFFFF"/>
+              <w:bottom w:val="single" w:sz="4" w:space="0" w:color="D9DEE3"/>
+              <w:right w:val="none" w:sz="0" w:space="0" w:color="FFFFFF"/>
+            </w:tcBorders>
+            <w:tcMar>
+              <w:top w:w="86" w:type="dxa"/>
+              <w:left w:w="64" w:type="dxa"/>
+              <w:bottom w:w="86" w:type="dxa"/>
+              <w:right w:w="64" w:type="dxa"/>
+            </w:tcMar>
+          </w:tcPr>
+          <w:p>
+            <w:r>
+              <w:rPr>
+                <w:rFonts w:eastAsia="Roboto"/>
+              </w:rPr>
+              <w:t>8.1%</w:t>
+            </w:r>
+          </w:p>
+        </w:tc>
+        <w:tc>
+          <w:tcPr>
+            <w:tcW w:w="0" w:type="auto"/>
+            <w:tcBorders>
+              <w:top w:val="none" w:sz="0" w:space="0" w:color="FFFFFF"/>
+              <w:left w:val="none" w:sz="0" w:space="0" w:color="FFFFFF"/>
+              <w:bottom w:val="single" w:sz="4" w:space="0" w:color="D9DEE3"/>
+              <w:right w:val="none" w:sz="0" w:space="0" w:color="FFFFFF"/>
+            </w:tcBorders>
+            <w:tcMar>
+              <w:top w:w="86" w:type="dxa"/>
+              <w:left w:w="64" w:type="dxa"/>
+              <w:bottom w:w="86" w:type="dxa"/>
+              <w:right w:w="64" w:type="dxa"/>
+            </w:tcMar>
+          </w:tcPr>
+          <w:p>
+            <w:r>
+              <w:rPr>
+                <w:rFonts w:eastAsia="Roboto"/>
+              </w:rPr>
+              <w:t>+12.4% (M3/M4 cycle tailwind)</w:t>
             </w:r>
           </w:p>
         </w:tc>
@@ -5830,57 +5825,57 @@
               <w:rPr>
                 <w:rFonts w:eastAsia="Roboto"/>
               </w:rPr>
-              <w:t>~$26.69B</w:t>
-            </w:r>
-          </w:p>
-        </w:tc>
-        <w:tc>
-          <w:tcPr>
-            <w:tcW w:w="0" w:type="auto"/>
-            <w:tcBorders>
-              <w:top w:val="none" w:sz="0" w:space="0" w:color="FFFFFF"/>
-              <w:left w:val="none" w:sz="0" w:space="0" w:color="FFFFFF"/>
-              <w:bottom w:val="single" w:sz="4" w:space="0" w:color="D9DEE3"/>
-              <w:right w:val="none" w:sz="0" w:space="0" w:color="FFFFFF"/>
-            </w:tcBorders>
-            <w:tcMar>
-              <w:top w:w="86" w:type="dxa"/>
-              <w:left w:w="64" w:type="dxa"/>
-              <w:bottom w:w="86" w:type="dxa"/>
-              <w:right w:w="64" w:type="dxa"/>
-            </w:tcMar>
-          </w:tcPr>
-          <w:p>
-            <w:r>
-              <w:rPr>
-                <w:rFonts w:eastAsia="Roboto"/>
-              </w:rPr>
-              <w:t>~6.8%</w:t>
-            </w:r>
-          </w:p>
-        </w:tc>
-        <w:tc>
-          <w:tcPr>
-            <w:tcW w:w="0" w:type="auto"/>
-            <w:tcBorders>
-              <w:top w:val="none" w:sz="0" w:space="0" w:color="FFFFFF"/>
-              <w:left w:val="none" w:sz="0" w:space="0" w:color="FFFFFF"/>
-              <w:bottom w:val="single" w:sz="4" w:space="0" w:color="D9DEE3"/>
-              <w:right w:val="none" w:sz="0" w:space="0" w:color="FFFFFF"/>
-            </w:tcBorders>
-            <w:tcMar>
-              <w:top w:w="86" w:type="dxa"/>
-              <w:left w:w="64" w:type="dxa"/>
-              <w:bottom w:w="86" w:type="dxa"/>
-              <w:right w:w="64" w:type="dxa"/>
-            </w:tcMar>
-          </w:tcPr>
-          <w:p>
-            <w:r>
-              <w:rPr>
-                <w:rFonts w:eastAsia="Roboto"/>
-              </w:rPr>
-              <w:t>~-6% (Q1 -25%, Q3 +24%)</w:t>
+              <w:t>$28.02B</w:t>
+            </w:r>
+          </w:p>
+        </w:tc>
+        <w:tc>
+          <w:tcPr>
+            <w:tcW w:w="0" w:type="auto"/>
+            <w:tcBorders>
+              <w:top w:val="none" w:sz="0" w:space="0" w:color="FFFFFF"/>
+              <w:left w:val="none" w:sz="0" w:space="0" w:color="FFFFFF"/>
+              <w:bottom w:val="single" w:sz="4" w:space="0" w:color="D9DEE3"/>
+              <w:right w:val="none" w:sz="0" w:space="0" w:color="FFFFFF"/>
+            </w:tcBorders>
+            <w:tcMar>
+              <w:top w:w="86" w:type="dxa"/>
+              <w:left w:w="64" w:type="dxa"/>
+              <w:bottom w:w="86" w:type="dxa"/>
+              <w:right w:w="64" w:type="dxa"/>
+            </w:tcMar>
+          </w:tcPr>
+          <w:p>
+            <w:r>
+              <w:rPr>
+                <w:rFonts w:eastAsia="Roboto"/>
+              </w:rPr>
+              <w:t>6.7%</w:t>
+            </w:r>
+          </w:p>
+        </w:tc>
+        <w:tc>
+          <w:tcPr>
+            <w:tcW w:w="0" w:type="auto"/>
+            <w:tcBorders>
+              <w:top w:val="none" w:sz="0" w:space="0" w:color="FFFFFF"/>
+              <w:left w:val="none" w:sz="0" w:space="0" w:color="FFFFFF"/>
+              <w:bottom w:val="single" w:sz="4" w:space="0" w:color="D9DEE3"/>
+              <w:right w:val="none" w:sz="0" w:space="0" w:color="FFFFFF"/>
+            </w:tcBorders>
+            <w:tcMar>
+              <w:top w:w="86" w:type="dxa"/>
+              <w:left w:w="64" w:type="dxa"/>
+              <w:bottom w:w="86" w:type="dxa"/>
+              <w:right w:w="64" w:type="dxa"/>
+            </w:tcMar>
+          </w:tcPr>
+          <w:p>
+            <w:r>
+              <w:rPr>
+                <w:rFonts w:eastAsia="Roboto"/>
+              </w:rPr>
+              <w:t>+5.0% (M4 iPad Pro refresh)</w:t>
             </w:r>
           </w:p>
         </w:tc>
@@ -5940,57 +5935,57 @@
               <w:rPr>
                 <w:rFonts w:eastAsia="Roboto"/>
               </w:rPr>
-              <w:t>~$37.01B</w:t>
-            </w:r>
-          </w:p>
-        </w:tc>
-        <w:tc>
-          <w:tcPr>
-            <w:tcW w:w="0" w:type="auto"/>
-            <w:tcBorders>
-              <w:top w:val="none" w:sz="0" w:space="0" w:color="FFFFFF"/>
-              <w:left w:val="none" w:sz="0" w:space="0" w:color="FFFFFF"/>
-              <w:bottom w:val="single" w:sz="4" w:space="0" w:color="D9DEE3"/>
-              <w:right w:val="none" w:sz="0" w:space="0" w:color="FFFFFF"/>
-            </w:tcBorders>
-            <w:tcMar>
-              <w:top w:w="86" w:type="dxa"/>
-              <w:left w:w="64" w:type="dxa"/>
-              <w:bottom w:w="86" w:type="dxa"/>
-              <w:right w:w="64" w:type="dxa"/>
-            </w:tcMar>
-          </w:tcPr>
-          <w:p>
-            <w:r>
-              <w:rPr>
-                <w:rFonts w:eastAsia="Roboto"/>
-              </w:rPr>
-              <w:t>~9.5%</w:t>
-            </w:r>
-          </w:p>
-        </w:tc>
-        <w:tc>
-          <w:tcPr>
-            <w:tcW w:w="0" w:type="auto"/>
-            <w:tcBorders>
-              <w:top w:val="none" w:sz="0" w:space="0" w:color="FFFFFF"/>
-              <w:left w:val="none" w:sz="0" w:space="0" w:color="FFFFFF"/>
-              <w:bottom w:val="single" w:sz="4" w:space="0" w:color="D9DEE3"/>
-              <w:right w:val="none" w:sz="0" w:space="0" w:color="FFFFFF"/>
-            </w:tcBorders>
-            <w:tcMar>
-              <w:top w:w="86" w:type="dxa"/>
-              <w:left w:w="64" w:type="dxa"/>
-              <w:bottom w:w="86" w:type="dxa"/>
-              <w:right w:w="64" w:type="dxa"/>
-            </w:tcMar>
-          </w:tcPr>
-          <w:p>
-            <w:r>
-              <w:rPr>
-                <w:rFonts w:eastAsia="Roboto"/>
-              </w:rPr>
-              <w:t>~-7% (Q1 -11%, Q4 -3%)</w:t>
+              <w:t>$35.69B</w:t>
+            </w:r>
+          </w:p>
+        </w:tc>
+        <w:tc>
+          <w:tcPr>
+            <w:tcW w:w="0" w:type="auto"/>
+            <w:tcBorders>
+              <w:top w:val="none" w:sz="0" w:space="0" w:color="FFFFFF"/>
+              <w:left w:val="none" w:sz="0" w:space="0" w:color="FFFFFF"/>
+              <w:bottom w:val="single" w:sz="4" w:space="0" w:color="D9DEE3"/>
+              <w:right w:val="none" w:sz="0" w:space="0" w:color="FFFFFF"/>
+            </w:tcBorders>
+            <w:tcMar>
+              <w:top w:w="86" w:type="dxa"/>
+              <w:left w:w="64" w:type="dxa"/>
+              <w:bottom w:w="86" w:type="dxa"/>
+              <w:right w:w="64" w:type="dxa"/>
+            </w:tcMar>
+          </w:tcPr>
+          <w:p>
+            <w:r>
+              <w:rPr>
+                <w:rFonts w:eastAsia="Roboto"/>
+              </w:rPr>
+              <w:t>8.6%</w:t>
+            </w:r>
+          </w:p>
+        </w:tc>
+        <w:tc>
+          <w:tcPr>
+            <w:tcW w:w="0" w:type="auto"/>
+            <w:tcBorders>
+              <w:top w:val="none" w:sz="0" w:space="0" w:color="FFFFFF"/>
+              <w:left w:val="none" w:sz="0" w:space="0" w:color="FFFFFF"/>
+              <w:bottom w:val="single" w:sz="4" w:space="0" w:color="D9DEE3"/>
+              <w:right w:val="none" w:sz="0" w:space="0" w:color="FFFFFF"/>
+            </w:tcBorders>
+            <w:tcMar>
+              <w:top w:w="86" w:type="dxa"/>
+              <w:left w:w="64" w:type="dxa"/>
+              <w:bottom w:w="86" w:type="dxa"/>
+              <w:right w:w="64" w:type="dxa"/>
+            </w:tcMar>
+          </w:tcPr>
+          <w:p>
+            <w:r>
+              <w:rPr>
+                <w:rFonts w:eastAsia="Roboto"/>
+              </w:rPr>
+              <w:t>-3.6% (Q4 stabilized)</w:t>
             </w:r>
           </w:p>
         </w:tc>
@@ -6050,57 +6045,57 @@
               <w:rPr>
                 <w:rFonts w:eastAsia="Roboto"/>
               </w:rPr>
-              <w:t>$96.17B</w:t>
-            </w:r>
-          </w:p>
-        </w:tc>
-        <w:tc>
-          <w:tcPr>
-            <w:tcW w:w="0" w:type="auto"/>
-            <w:tcBorders>
-              <w:top w:val="none" w:sz="0" w:space="0" w:color="FFFFFF"/>
-              <w:left w:val="none" w:sz="0" w:space="0" w:color="FFFFFF"/>
-              <w:bottom w:val="single" w:sz="4" w:space="0" w:color="D9DEE3"/>
-              <w:right w:val="none" w:sz="0" w:space="0" w:color="FFFFFF"/>
-            </w:tcBorders>
-            <w:tcMar>
-              <w:top w:w="86" w:type="dxa"/>
-              <w:left w:w="64" w:type="dxa"/>
-              <w:bottom w:w="86" w:type="dxa"/>
-              <w:right w:w="64" w:type="dxa"/>
-            </w:tcMar>
-          </w:tcPr>
-          <w:p>
-            <w:r>
-              <w:rPr>
-                <w:rFonts w:eastAsia="Roboto"/>
-              </w:rPr>
-              <w:t>24.6%</w:t>
-            </w:r>
-          </w:p>
-        </w:tc>
-        <w:tc>
-          <w:tcPr>
-            <w:tcW w:w="0" w:type="auto"/>
-            <w:tcBorders>
-              <w:top w:val="none" w:sz="0" w:space="0" w:color="FFFFFF"/>
-              <w:left w:val="none" w:sz="0" w:space="0" w:color="FFFFFF"/>
-              <w:bottom w:val="single" w:sz="4" w:space="0" w:color="D9DEE3"/>
-              <w:right w:val="none" w:sz="0" w:space="0" w:color="FFFFFF"/>
-            </w:tcBorders>
-            <w:tcMar>
-              <w:top w:w="86" w:type="dxa"/>
-              <w:left w:w="64" w:type="dxa"/>
-              <w:bottom w:w="86" w:type="dxa"/>
-              <w:right w:w="64" w:type="dxa"/>
-            </w:tcMar>
-          </w:tcPr>
-          <w:p>
-            <w:r>
-              <w:rPr>
-                <w:rFonts w:eastAsia="Roboto"/>
-              </w:rPr>
-              <w:t>+11–14%</w:t>
+              <w:t>$109.16B</w:t>
+            </w:r>
+          </w:p>
+        </w:tc>
+        <w:tc>
+          <w:tcPr>
+            <w:tcW w:w="0" w:type="auto"/>
+            <w:tcBorders>
+              <w:top w:val="none" w:sz="0" w:space="0" w:color="FFFFFF"/>
+              <w:left w:val="none" w:sz="0" w:space="0" w:color="FFFFFF"/>
+              <w:bottom w:val="single" w:sz="4" w:space="0" w:color="D9DEE3"/>
+              <w:right w:val="none" w:sz="0" w:space="0" w:color="FFFFFF"/>
+            </w:tcBorders>
+            <w:tcMar>
+              <w:top w:w="86" w:type="dxa"/>
+              <w:left w:w="64" w:type="dxa"/>
+              <w:bottom w:w="86" w:type="dxa"/>
+              <w:right w:w="64" w:type="dxa"/>
+            </w:tcMar>
+          </w:tcPr>
+          <w:p>
+            <w:r>
+              <w:rPr>
+                <w:rFonts w:eastAsia="Roboto"/>
+              </w:rPr>
+              <w:t>26.2%</w:t>
+            </w:r>
+          </w:p>
+        </w:tc>
+        <w:tc>
+          <w:tcPr>
+            <w:tcW w:w="0" w:type="auto"/>
+            <w:tcBorders>
+              <w:top w:val="none" w:sz="0" w:space="0" w:color="FFFFFF"/>
+              <w:left w:val="none" w:sz="0" w:space="0" w:color="FFFFFF"/>
+              <w:bottom w:val="single" w:sz="4" w:space="0" w:color="D9DEE3"/>
+              <w:right w:val="none" w:sz="0" w:space="0" w:color="FFFFFF"/>
+            </w:tcBorders>
+            <w:tcMar>
+              <w:top w:w="86" w:type="dxa"/>
+              <w:left w:w="64" w:type="dxa"/>
+              <w:bottom w:w="86" w:type="dxa"/>
+              <w:right w:w="64" w:type="dxa"/>
+            </w:tcMar>
+          </w:tcPr>
+          <w:p>
+            <w:r>
+              <w:rPr>
+                <w:rFonts w:eastAsia="Roboto"/>
+              </w:rPr>
+              <w:t>+13.5%</w:t>
             </w:r>
           </w:p>
         </w:tc>
@@ -6160,7 +6155,7 @@
               <w:rPr>
                 <w:rFonts w:eastAsia="Roboto"/>
               </w:rPr>
-              <w:t>$391.04B</w:t>
+              <w:t>$416.16B</w:t>
             </w:r>
           </w:p>
         </w:tc>
@@ -6210,7 +6205,7 @@
               <w:rPr>
                 <w:rFonts w:eastAsia="Roboto"/>
               </w:rPr>
-              <w:t>+2.0%</w:t>
+              <w:t>+6.4%</w:t>
             </w:r>
           </w:p>
         </w:tc>
@@ -6229,21 +6224,19 @@
         <w:rPr>
           <w:rFonts w:eastAsia="Roboto"/>
         </w:rPr>
-        <w:t xml:space="preserve">The segment mix shows iPhone re-accelerating post Q2 FY24 (the -10% trough), Mac benefiting from M3/M4 cycles (+16% by FY25Q1), and iPad/Wearables both structurally soft. Services crossed the 24% mix threshold for the first time on a full-year basis, and at FY25Q3 hit 29.2% of single-quarter revenue — the single highest Services </w:t>
+        <w:t>The segment mix reveals Apple's structural shift toward Services: crossing 26% of total revenue for the first time, Services was the fastest-growing segment at +13.5% YoY, followed by Mac at +12.4% (M4 cycle tailwind) and iPad at +5.0% (M4 iPad Pro refresh). iPhone grew +4.2% to $209.6B, still the dominant segment at 50.4% but losing mix share as Services expands. Wearables remained the sole drag at -3.6% YoY, though stabilizing in Q4 as Apple Watch and AirPods Pro both returned to growth. The mix-shift math is the core of the thesis: every 1pp shift from Products to Services adds ~38bps to blended gross margin.</w:t>
       </w:r>
       <w:proofErr w:type="gramStart"/>
       <w:r>
         <w:rPr>
           <w:rFonts w:eastAsia="Roboto"/>
         </w:rPr>
-        <w:t>mix print</w:t>
       </w:r>
       <w:proofErr w:type="gramEnd"/>
       <w:r>
         <w:rPr>
           <w:rFonts w:eastAsia="Roboto"/>
         </w:rPr>
-        <w:t xml:space="preserve"> in Apple history. The Wearables decline (~-7% FY24) is the only truly concerning segment signal; our Pillar 2 thesis does not require Wearables to grow, only Services to sustain +10% CAGR.</w:t>
       </w:r>
     </w:p>
     <w:p>
@@ -6259,7 +6252,7 @@
           <w:sz w:val="24"/>
           <w:szCs w:val="24"/>
         </w:rPr>
-        <w:t>2.4 FY2024 Geographic Mix</w:t>
+        <w:t>2.4 FY2025 Geographic Mix</w:t>
       </w:r>
     </w:p>
     <w:tbl>
@@ -6347,7 +6340,7 @@
                 <w:bCs/>
                 <w:color w:val="FFFFFF"/>
               </w:rPr>
-              <w:t>FY24 Revenue</w:t>
+              <w:t>FY25 Revenue</w:t>
             </w:r>
           </w:p>
         </w:tc>
@@ -6405,7 +6398,7 @@
                 <w:bCs/>
                 <w:color w:val="FFFFFF"/>
               </w:rPr>
-              <w:t>FY24 YoY</w:t>
+              <w:t>FY25 YoY</w:t>
             </w:r>
           </w:p>
         </w:tc>
@@ -6494,82 +6487,82 @@
               <w:rPr>
                 <w:rFonts w:eastAsia="Roboto"/>
               </w:rPr>
-              <w:t>$167.05B</w:t>
-            </w:r>
-          </w:p>
-        </w:tc>
-        <w:tc>
-          <w:tcPr>
-            <w:tcW w:w="0" w:type="auto"/>
-            <w:tcBorders>
-              <w:top w:val="none" w:sz="0" w:space="0" w:color="FFFFFF"/>
-              <w:left w:val="none" w:sz="0" w:space="0" w:color="FFFFFF"/>
-              <w:bottom w:val="single" w:sz="4" w:space="0" w:color="D9DEE3"/>
-              <w:right w:val="none" w:sz="0" w:space="0" w:color="FFFFFF"/>
-            </w:tcBorders>
-            <w:tcMar>
-              <w:top w:w="86" w:type="dxa"/>
-              <w:left w:w="64" w:type="dxa"/>
-              <w:bottom w:w="86" w:type="dxa"/>
-              <w:right w:w="64" w:type="dxa"/>
-            </w:tcMar>
-          </w:tcPr>
-          <w:p>
-            <w:r>
-              <w:rPr>
-                <w:rFonts w:eastAsia="Roboto"/>
-              </w:rPr>
-              <w:t>42.7%</w:t>
-            </w:r>
-          </w:p>
-        </w:tc>
-        <w:tc>
-          <w:tcPr>
-            <w:tcW w:w="0" w:type="auto"/>
-            <w:tcBorders>
-              <w:top w:val="none" w:sz="0" w:space="0" w:color="FFFFFF"/>
-              <w:left w:val="none" w:sz="0" w:space="0" w:color="FFFFFF"/>
-              <w:bottom w:val="single" w:sz="4" w:space="0" w:color="D9DEE3"/>
-              <w:right w:val="none" w:sz="0" w:space="0" w:color="FFFFFF"/>
-            </w:tcBorders>
-            <w:tcMar>
-              <w:top w:w="86" w:type="dxa"/>
-              <w:left w:w="64" w:type="dxa"/>
-              <w:bottom w:w="86" w:type="dxa"/>
-              <w:right w:w="64" w:type="dxa"/>
-            </w:tcMar>
-          </w:tcPr>
-          <w:p>
-            <w:r>
-              <w:rPr>
-                <w:rFonts w:eastAsia="Roboto"/>
-              </w:rPr>
-              <w:t>+3%</w:t>
-            </w:r>
-          </w:p>
-        </w:tc>
-        <w:tc>
-          <w:tcPr>
-            <w:tcW w:w="0" w:type="auto"/>
-            <w:tcBorders>
-              <w:top w:val="none" w:sz="0" w:space="0" w:color="FFFFFF"/>
-              <w:left w:val="none" w:sz="0" w:space="0" w:color="FFFFFF"/>
-              <w:bottom w:val="single" w:sz="4" w:space="0" w:color="D9DEE3"/>
-              <w:right w:val="none" w:sz="0" w:space="0" w:color="FFFFFF"/>
-            </w:tcBorders>
-            <w:tcMar>
-              <w:top w:w="86" w:type="dxa"/>
-              <w:left w:w="64" w:type="dxa"/>
-              <w:bottom w:w="86" w:type="dxa"/>
-              <w:right w:w="64" w:type="dxa"/>
-            </w:tcMar>
-          </w:tcPr>
-          <w:p>
-            <w:r>
-              <w:rPr>
-                <w:rFonts w:eastAsia="Roboto"/>
-              </w:rPr>
-              <w:t>40.5%</w:t>
+              <w:t>$178.35B</w:t>
+            </w:r>
+          </w:p>
+        </w:tc>
+        <w:tc>
+          <w:tcPr>
+            <w:tcW w:w="0" w:type="auto"/>
+            <w:tcBorders>
+              <w:top w:val="none" w:sz="0" w:space="0" w:color="FFFFFF"/>
+              <w:left w:val="none" w:sz="0" w:space="0" w:color="FFFFFF"/>
+              <w:bottom w:val="single" w:sz="4" w:space="0" w:color="D9DEE3"/>
+              <w:right w:val="none" w:sz="0" w:space="0" w:color="FFFFFF"/>
+            </w:tcBorders>
+            <w:tcMar>
+              <w:top w:w="86" w:type="dxa"/>
+              <w:left w:w="64" w:type="dxa"/>
+              <w:bottom w:w="86" w:type="dxa"/>
+              <w:right w:w="64" w:type="dxa"/>
+            </w:tcMar>
+          </w:tcPr>
+          <w:p>
+            <w:r>
+              <w:rPr>
+                <w:rFonts w:eastAsia="Roboto"/>
+              </w:rPr>
+              <w:t>42.8%</w:t>
+            </w:r>
+          </w:p>
+        </w:tc>
+        <w:tc>
+          <w:tcPr>
+            <w:tcW w:w="0" w:type="auto"/>
+            <w:tcBorders>
+              <w:top w:val="none" w:sz="0" w:space="0" w:color="FFFFFF"/>
+              <w:left w:val="none" w:sz="0" w:space="0" w:color="FFFFFF"/>
+              <w:bottom w:val="single" w:sz="4" w:space="0" w:color="D9DEE3"/>
+              <w:right w:val="none" w:sz="0" w:space="0" w:color="FFFFFF"/>
+            </w:tcBorders>
+            <w:tcMar>
+              <w:top w:w="86" w:type="dxa"/>
+              <w:left w:w="64" w:type="dxa"/>
+              <w:bottom w:w="86" w:type="dxa"/>
+              <w:right w:w="64" w:type="dxa"/>
+            </w:tcMar>
+          </w:tcPr>
+          <w:p>
+            <w:r>
+              <w:rPr>
+                <w:rFonts w:eastAsia="Roboto"/>
+              </w:rPr>
+              <w:t>+6.8%</w:t>
+            </w:r>
+          </w:p>
+        </w:tc>
+        <w:tc>
+          <w:tcPr>
+            <w:tcW w:w="0" w:type="auto"/>
+            <w:tcBorders>
+              <w:top w:val="none" w:sz="0" w:space="0" w:color="FFFFFF"/>
+              <w:left w:val="none" w:sz="0" w:space="0" w:color="FFFFFF"/>
+              <w:bottom w:val="single" w:sz="4" w:space="0" w:color="D9DEE3"/>
+              <w:right w:val="none" w:sz="0" w:space="0" w:color="FFFFFF"/>
+            </w:tcBorders>
+            <w:tcMar>
+              <w:top w:w="86" w:type="dxa"/>
+              <w:left w:w="64" w:type="dxa"/>
+              <w:bottom w:w="86" w:type="dxa"/>
+              <w:right w:w="64" w:type="dxa"/>
+            </w:tcMar>
+          </w:tcPr>
+          <w:p>
+            <w:r>
+              <w:rPr>
+                <w:rFonts w:eastAsia="Roboto"/>
+              </w:rPr>
+              <w:t>~41.5%</w:t>
             </w:r>
           </w:p>
         </w:tc>
@@ -6629,82 +6622,82 @@
               <w:rPr>
                 <w:rFonts w:eastAsia="Roboto"/>
               </w:rPr>
-              <w:t>$101.33B</w:t>
-            </w:r>
-          </w:p>
-        </w:tc>
-        <w:tc>
-          <w:tcPr>
-            <w:tcW w:w="0" w:type="auto"/>
-            <w:tcBorders>
-              <w:top w:val="none" w:sz="0" w:space="0" w:color="FFFFFF"/>
-              <w:left w:val="none" w:sz="0" w:space="0" w:color="FFFFFF"/>
-              <w:bottom w:val="single" w:sz="4" w:space="0" w:color="D9DEE3"/>
-              <w:right w:val="none" w:sz="0" w:space="0" w:color="FFFFFF"/>
-            </w:tcBorders>
-            <w:tcMar>
-              <w:top w:w="86" w:type="dxa"/>
-              <w:left w:w="64" w:type="dxa"/>
-              <w:bottom w:w="86" w:type="dxa"/>
-              <w:right w:w="64" w:type="dxa"/>
-            </w:tcMar>
-          </w:tcPr>
-          <w:p>
-            <w:r>
-              <w:rPr>
-                <w:rFonts w:eastAsia="Roboto"/>
-              </w:rPr>
-              <w:t>25.9%</w:t>
-            </w:r>
-          </w:p>
-        </w:tc>
-        <w:tc>
-          <w:tcPr>
-            <w:tcW w:w="0" w:type="auto"/>
-            <w:tcBorders>
-              <w:top w:val="none" w:sz="0" w:space="0" w:color="FFFFFF"/>
-              <w:left w:val="none" w:sz="0" w:space="0" w:color="FFFFFF"/>
-              <w:bottom w:val="single" w:sz="4" w:space="0" w:color="D9DEE3"/>
-              <w:right w:val="none" w:sz="0" w:space="0" w:color="FFFFFF"/>
-            </w:tcBorders>
-            <w:tcMar>
-              <w:top w:w="86" w:type="dxa"/>
-              <w:left w:w="64" w:type="dxa"/>
-              <w:bottom w:w="86" w:type="dxa"/>
-              <w:right w:w="64" w:type="dxa"/>
-            </w:tcMar>
-          </w:tcPr>
-          <w:p>
-            <w:r>
-              <w:rPr>
-                <w:rFonts w:eastAsia="Roboto"/>
-              </w:rPr>
-              <w:t>+7%</w:t>
-            </w:r>
-          </w:p>
-        </w:tc>
-        <w:tc>
-          <w:tcPr>
-            <w:tcW w:w="0" w:type="auto"/>
-            <w:tcBorders>
-              <w:top w:val="none" w:sz="0" w:space="0" w:color="FFFFFF"/>
-              <w:left w:val="none" w:sz="0" w:space="0" w:color="FFFFFF"/>
-              <w:bottom w:val="single" w:sz="4" w:space="0" w:color="D9DEE3"/>
-              <w:right w:val="none" w:sz="0" w:space="0" w:color="FFFFFF"/>
-            </w:tcBorders>
-            <w:tcMar>
-              <w:top w:w="86" w:type="dxa"/>
-              <w:left w:w="64" w:type="dxa"/>
-              <w:bottom w:w="86" w:type="dxa"/>
-              <w:right w:w="64" w:type="dxa"/>
-            </w:tcMar>
-          </w:tcPr>
-          <w:p>
-            <w:r>
-              <w:rPr>
-                <w:rFonts w:eastAsia="Roboto"/>
-              </w:rPr>
-              <w:t>41.2%</w:t>
+              <w:t>$111.03B</w:t>
+            </w:r>
+          </w:p>
+        </w:tc>
+        <w:tc>
+          <w:tcPr>
+            <w:tcW w:w="0" w:type="auto"/>
+            <w:tcBorders>
+              <w:top w:val="none" w:sz="0" w:space="0" w:color="FFFFFF"/>
+              <w:left w:val="none" w:sz="0" w:space="0" w:color="FFFFFF"/>
+              <w:bottom w:val="single" w:sz="4" w:space="0" w:color="D9DEE3"/>
+              <w:right w:val="none" w:sz="0" w:space="0" w:color="FFFFFF"/>
+            </w:tcBorders>
+            <w:tcMar>
+              <w:top w:w="86" w:type="dxa"/>
+              <w:left w:w="64" w:type="dxa"/>
+              <w:bottom w:w="86" w:type="dxa"/>
+              <w:right w:w="64" w:type="dxa"/>
+            </w:tcMar>
+          </w:tcPr>
+          <w:p>
+            <w:r>
+              <w:rPr>
+                <w:rFonts w:eastAsia="Roboto"/>
+              </w:rPr>
+              <w:t>26.7%</w:t>
+            </w:r>
+          </w:p>
+        </w:tc>
+        <w:tc>
+          <w:tcPr>
+            <w:tcW w:w="0" w:type="auto"/>
+            <w:tcBorders>
+              <w:top w:val="none" w:sz="0" w:space="0" w:color="FFFFFF"/>
+              <w:left w:val="none" w:sz="0" w:space="0" w:color="FFFFFF"/>
+              <w:bottom w:val="single" w:sz="4" w:space="0" w:color="D9DEE3"/>
+              <w:right w:val="none" w:sz="0" w:space="0" w:color="FFFFFF"/>
+            </w:tcBorders>
+            <w:tcMar>
+              <w:top w:w="86" w:type="dxa"/>
+              <w:left w:w="64" w:type="dxa"/>
+              <w:bottom w:w="86" w:type="dxa"/>
+              <w:right w:w="64" w:type="dxa"/>
+            </w:tcMar>
+          </w:tcPr>
+          <w:p>
+            <w:r>
+              <w:rPr>
+                <w:rFonts w:eastAsia="Roboto"/>
+              </w:rPr>
+              <w:t>+9.6%</w:t>
+            </w:r>
+          </w:p>
+        </w:tc>
+        <w:tc>
+          <w:tcPr>
+            <w:tcW w:w="0" w:type="auto"/>
+            <w:tcBorders>
+              <w:top w:val="none" w:sz="0" w:space="0" w:color="FFFFFF"/>
+              <w:left w:val="none" w:sz="0" w:space="0" w:color="FFFFFF"/>
+              <w:bottom w:val="single" w:sz="4" w:space="0" w:color="D9DEE3"/>
+              <w:right w:val="none" w:sz="0" w:space="0" w:color="FFFFFF"/>
+            </w:tcBorders>
+            <w:tcMar>
+              <w:top w:w="86" w:type="dxa"/>
+              <w:left w:w="64" w:type="dxa"/>
+              <w:bottom w:w="86" w:type="dxa"/>
+              <w:right w:w="64" w:type="dxa"/>
+            </w:tcMar>
+          </w:tcPr>
+          <w:p>
+            <w:r>
+              <w:rPr>
+                <w:rFonts w:eastAsia="Roboto"/>
+              </w:rPr>
+              <w:t>~42.0%</w:t>
             </w:r>
           </w:p>
         </w:tc>
@@ -6764,82 +6757,82 @@
               <w:rPr>
                 <w:rFonts w:eastAsia="Roboto"/>
               </w:rPr>
-              <w:t>$66.95B</w:t>
-            </w:r>
-          </w:p>
-        </w:tc>
-        <w:tc>
-          <w:tcPr>
-            <w:tcW w:w="0" w:type="auto"/>
-            <w:tcBorders>
-              <w:top w:val="none" w:sz="0" w:space="0" w:color="FFFFFF"/>
-              <w:left w:val="none" w:sz="0" w:space="0" w:color="FFFFFF"/>
-              <w:bottom w:val="single" w:sz="4" w:space="0" w:color="D9DEE3"/>
-              <w:right w:val="none" w:sz="0" w:space="0" w:color="FFFFFF"/>
-            </w:tcBorders>
-            <w:tcMar>
-              <w:top w:w="86" w:type="dxa"/>
-              <w:left w:w="64" w:type="dxa"/>
-              <w:bottom w:w="86" w:type="dxa"/>
-              <w:right w:w="64" w:type="dxa"/>
-            </w:tcMar>
-          </w:tcPr>
-          <w:p>
-            <w:r>
-              <w:rPr>
-                <w:rFonts w:eastAsia="Roboto"/>
-              </w:rPr>
-              <w:t>17.1%</w:t>
-            </w:r>
-          </w:p>
-        </w:tc>
-        <w:tc>
-          <w:tcPr>
-            <w:tcW w:w="0" w:type="auto"/>
-            <w:tcBorders>
-              <w:top w:val="none" w:sz="0" w:space="0" w:color="FFFFFF"/>
-              <w:left w:val="none" w:sz="0" w:space="0" w:color="FFFFFF"/>
-              <w:bottom w:val="single" w:sz="4" w:space="0" w:color="D9DEE3"/>
-              <w:right w:val="none" w:sz="0" w:space="0" w:color="FFFFFF"/>
-            </w:tcBorders>
-            <w:tcMar>
-              <w:top w:w="86" w:type="dxa"/>
-              <w:left w:w="64" w:type="dxa"/>
-              <w:bottom w:w="86" w:type="dxa"/>
-              <w:right w:w="64" w:type="dxa"/>
-            </w:tcMar>
-          </w:tcPr>
-          <w:p>
-            <w:r>
-              <w:rPr>
-                <w:rFonts w:eastAsia="Roboto"/>
-              </w:rPr>
-              <w:t>-8%</w:t>
-            </w:r>
-          </w:p>
-        </w:tc>
-        <w:tc>
-          <w:tcPr>
-            <w:tcW w:w="0" w:type="auto"/>
-            <w:tcBorders>
-              <w:top w:val="none" w:sz="0" w:space="0" w:color="FFFFFF"/>
-              <w:left w:val="none" w:sz="0" w:space="0" w:color="FFFFFF"/>
-              <w:bottom w:val="single" w:sz="4" w:space="0" w:color="D9DEE3"/>
-              <w:right w:val="none" w:sz="0" w:space="0" w:color="FFFFFF"/>
-            </w:tcBorders>
-            <w:tcMar>
-              <w:top w:w="86" w:type="dxa"/>
-              <w:left w:w="64" w:type="dxa"/>
-              <w:bottom w:w="86" w:type="dxa"/>
-              <w:right w:w="64" w:type="dxa"/>
-            </w:tcMar>
-          </w:tcPr>
-          <w:p>
-            <w:r>
-              <w:rPr>
-                <w:rFonts w:eastAsia="Roboto"/>
-              </w:rPr>
-              <w:t>40.5%</w:t>
+              <w:t>$64.38B</w:t>
+            </w:r>
+          </w:p>
+        </w:tc>
+        <w:tc>
+          <w:tcPr>
+            <w:tcW w:w="0" w:type="auto"/>
+            <w:tcBorders>
+              <w:top w:val="none" w:sz="0" w:space="0" w:color="FFFFFF"/>
+              <w:left w:val="none" w:sz="0" w:space="0" w:color="FFFFFF"/>
+              <w:bottom w:val="single" w:sz="4" w:space="0" w:color="D9DEE3"/>
+              <w:right w:val="none" w:sz="0" w:space="0" w:color="FFFFFF"/>
+            </w:tcBorders>
+            <w:tcMar>
+              <w:top w:w="86" w:type="dxa"/>
+              <w:left w:w="64" w:type="dxa"/>
+              <w:bottom w:w="86" w:type="dxa"/>
+              <w:right w:w="64" w:type="dxa"/>
+            </w:tcMar>
+          </w:tcPr>
+          <w:p>
+            <w:r>
+              <w:rPr>
+                <w:rFonts w:eastAsia="Roboto"/>
+              </w:rPr>
+              <w:t>15.5%</w:t>
+            </w:r>
+          </w:p>
+        </w:tc>
+        <w:tc>
+          <w:tcPr>
+            <w:tcW w:w="0" w:type="auto"/>
+            <w:tcBorders>
+              <w:top w:val="none" w:sz="0" w:space="0" w:color="FFFFFF"/>
+              <w:left w:val="none" w:sz="0" w:space="0" w:color="FFFFFF"/>
+              <w:bottom w:val="single" w:sz="4" w:space="0" w:color="D9DEE3"/>
+              <w:right w:val="none" w:sz="0" w:space="0" w:color="FFFFFF"/>
+            </w:tcBorders>
+            <w:tcMar>
+              <w:top w:w="86" w:type="dxa"/>
+              <w:left w:w="64" w:type="dxa"/>
+              <w:bottom w:w="86" w:type="dxa"/>
+              <w:right w:w="64" w:type="dxa"/>
+            </w:tcMar>
+          </w:tcPr>
+          <w:p>
+            <w:r>
+              <w:rPr>
+                <w:rFonts w:eastAsia="Roboto"/>
+              </w:rPr>
+              <w:t>-3.8%</w:t>
+            </w:r>
+          </w:p>
+        </w:tc>
+        <w:tc>
+          <w:tcPr>
+            <w:tcW w:w="0" w:type="auto"/>
+            <w:tcBorders>
+              <w:top w:val="none" w:sz="0" w:space="0" w:color="FFFFFF"/>
+              <w:left w:val="none" w:sz="0" w:space="0" w:color="FFFFFF"/>
+              <w:bottom w:val="single" w:sz="4" w:space="0" w:color="D9DEE3"/>
+              <w:right w:val="none" w:sz="0" w:space="0" w:color="FFFFFF"/>
+            </w:tcBorders>
+            <w:tcMar>
+              <w:top w:w="86" w:type="dxa"/>
+              <w:left w:w="64" w:type="dxa"/>
+              <w:bottom w:w="86" w:type="dxa"/>
+              <w:right w:w="64" w:type="dxa"/>
+            </w:tcMar>
+          </w:tcPr>
+          <w:p>
+            <w:r>
+              <w:rPr>
+                <w:rFonts w:eastAsia="Roboto"/>
+              </w:rPr>
+              <w:t>~39.5%</w:t>
             </w:r>
           </w:p>
         </w:tc>
@@ -6899,82 +6892,82 @@
               <w:rPr>
                 <w:rFonts w:eastAsia="Roboto"/>
               </w:rPr>
-              <w:t>$25.05B</w:t>
-            </w:r>
-          </w:p>
-        </w:tc>
-        <w:tc>
-          <w:tcPr>
-            <w:tcW w:w="0" w:type="auto"/>
-            <w:tcBorders>
-              <w:top w:val="none" w:sz="0" w:space="0" w:color="FFFFFF"/>
-              <w:left w:val="none" w:sz="0" w:space="0" w:color="FFFFFF"/>
-              <w:bottom w:val="single" w:sz="4" w:space="0" w:color="D9DEE3"/>
-              <w:right w:val="none" w:sz="0" w:space="0" w:color="FFFFFF"/>
-            </w:tcBorders>
-            <w:tcMar>
-              <w:top w:w="86" w:type="dxa"/>
-              <w:left w:w="64" w:type="dxa"/>
-              <w:bottom w:w="86" w:type="dxa"/>
-              <w:right w:w="64" w:type="dxa"/>
-            </w:tcMar>
-          </w:tcPr>
-          <w:p>
-            <w:r>
-              <w:rPr>
-                <w:rFonts w:eastAsia="Roboto"/>
-              </w:rPr>
-              <w:t>6.4%</w:t>
-            </w:r>
-          </w:p>
-        </w:tc>
-        <w:tc>
-          <w:tcPr>
-            <w:tcW w:w="0" w:type="auto"/>
-            <w:tcBorders>
-              <w:top w:val="none" w:sz="0" w:space="0" w:color="FFFFFF"/>
-              <w:left w:val="none" w:sz="0" w:space="0" w:color="FFFFFF"/>
-              <w:bottom w:val="single" w:sz="4" w:space="0" w:color="D9DEE3"/>
-              <w:right w:val="none" w:sz="0" w:space="0" w:color="FFFFFF"/>
-            </w:tcBorders>
-            <w:tcMar>
-              <w:top w:w="86" w:type="dxa"/>
-              <w:left w:w="64" w:type="dxa"/>
-              <w:bottom w:w="86" w:type="dxa"/>
-              <w:right w:w="64" w:type="dxa"/>
-            </w:tcMar>
-          </w:tcPr>
-          <w:p>
-            <w:r>
-              <w:rPr>
-                <w:rFonts w:eastAsia="Roboto"/>
-              </w:rPr>
-              <w:t>+3%</w:t>
-            </w:r>
-          </w:p>
-        </w:tc>
-        <w:tc>
-          <w:tcPr>
-            <w:tcW w:w="0" w:type="auto"/>
-            <w:tcBorders>
-              <w:top w:val="none" w:sz="0" w:space="0" w:color="FFFFFF"/>
-              <w:left w:val="none" w:sz="0" w:space="0" w:color="FFFFFF"/>
-              <w:bottom w:val="single" w:sz="4" w:space="0" w:color="D9DEE3"/>
-              <w:right w:val="none" w:sz="0" w:space="0" w:color="FFFFFF"/>
-            </w:tcBorders>
-            <w:tcMar>
-              <w:top w:w="86" w:type="dxa"/>
-              <w:left w:w="64" w:type="dxa"/>
-              <w:bottom w:w="86" w:type="dxa"/>
-              <w:right w:w="64" w:type="dxa"/>
-            </w:tcMar>
-          </w:tcPr>
-          <w:p>
-            <w:r>
-              <w:rPr>
-                <w:rFonts w:eastAsia="Roboto"/>
-              </w:rPr>
-              <w:t>49.7%</w:t>
+              <w:t>$28.70B</w:t>
+            </w:r>
+          </w:p>
+        </w:tc>
+        <w:tc>
+          <w:tcPr>
+            <w:tcW w:w="0" w:type="auto"/>
+            <w:tcBorders>
+              <w:top w:val="none" w:sz="0" w:space="0" w:color="FFFFFF"/>
+              <w:left w:val="none" w:sz="0" w:space="0" w:color="FFFFFF"/>
+              <w:bottom w:val="single" w:sz="4" w:space="0" w:color="D9DEE3"/>
+              <w:right w:val="none" w:sz="0" w:space="0" w:color="FFFFFF"/>
+            </w:tcBorders>
+            <w:tcMar>
+              <w:top w:w="86" w:type="dxa"/>
+              <w:left w:w="64" w:type="dxa"/>
+              <w:bottom w:w="86" w:type="dxa"/>
+              <w:right w:w="64" w:type="dxa"/>
+            </w:tcMar>
+          </w:tcPr>
+          <w:p>
+            <w:r>
+              <w:rPr>
+                <w:rFonts w:eastAsia="Roboto"/>
+              </w:rPr>
+              <w:t>6.9%</w:t>
+            </w:r>
+          </w:p>
+        </w:tc>
+        <w:tc>
+          <w:tcPr>
+            <w:tcW w:w="0" w:type="auto"/>
+            <w:tcBorders>
+              <w:top w:val="none" w:sz="0" w:space="0" w:color="FFFFFF"/>
+              <w:left w:val="none" w:sz="0" w:space="0" w:color="FFFFFF"/>
+              <w:bottom w:val="single" w:sz="4" w:space="0" w:color="D9DEE3"/>
+              <w:right w:val="none" w:sz="0" w:space="0" w:color="FFFFFF"/>
+            </w:tcBorders>
+            <w:tcMar>
+              <w:top w:w="86" w:type="dxa"/>
+              <w:left w:w="64" w:type="dxa"/>
+              <w:bottom w:w="86" w:type="dxa"/>
+              <w:right w:w="64" w:type="dxa"/>
+            </w:tcMar>
+          </w:tcPr>
+          <w:p>
+            <w:r>
+              <w:rPr>
+                <w:rFonts w:eastAsia="Roboto"/>
+              </w:rPr>
+              <w:t>+14.6%</w:t>
+            </w:r>
+          </w:p>
+        </w:tc>
+        <w:tc>
+          <w:tcPr>
+            <w:tcW w:w="0" w:type="auto"/>
+            <w:tcBorders>
+              <w:top w:val="none" w:sz="0" w:space="0" w:color="FFFFFF"/>
+              <w:left w:val="none" w:sz="0" w:space="0" w:color="FFFFFF"/>
+              <w:bottom w:val="single" w:sz="4" w:space="0" w:color="D9DEE3"/>
+              <w:right w:val="none" w:sz="0" w:space="0" w:color="FFFFFF"/>
+            </w:tcBorders>
+            <w:tcMar>
+              <w:top w:w="86" w:type="dxa"/>
+              <w:left w:w="64" w:type="dxa"/>
+              <w:bottom w:w="86" w:type="dxa"/>
+              <w:right w:w="64" w:type="dxa"/>
+            </w:tcMar>
+          </w:tcPr>
+          <w:p>
+            <w:r>
+              <w:rPr>
+                <w:rFonts w:eastAsia="Roboto"/>
+              </w:rPr>
+              <w:t>~50.0%</w:t>
             </w:r>
           </w:p>
         </w:tc>
@@ -7034,82 +7027,82 @@
               <w:rPr>
                 <w:rFonts w:eastAsia="Roboto"/>
               </w:rPr>
-              <w:t>$30.66B</w:t>
-            </w:r>
-          </w:p>
-        </w:tc>
-        <w:tc>
-          <w:tcPr>
-            <w:tcW w:w="0" w:type="auto"/>
-            <w:tcBorders>
-              <w:top w:val="none" w:sz="0" w:space="0" w:color="FFFFFF"/>
-              <w:left w:val="none" w:sz="0" w:space="0" w:color="FFFFFF"/>
-              <w:bottom w:val="single" w:sz="4" w:space="0" w:color="D9DEE3"/>
-              <w:right w:val="none" w:sz="0" w:space="0" w:color="FFFFFF"/>
-            </w:tcBorders>
-            <w:tcMar>
-              <w:top w:w="86" w:type="dxa"/>
-              <w:left w:w="64" w:type="dxa"/>
-              <w:bottom w:w="86" w:type="dxa"/>
-              <w:right w:w="64" w:type="dxa"/>
-            </w:tcMar>
-          </w:tcPr>
-          <w:p>
-            <w:r>
-              <w:rPr>
-                <w:rFonts w:eastAsia="Roboto"/>
-              </w:rPr>
-              <w:t>7.8%</w:t>
-            </w:r>
-          </w:p>
-        </w:tc>
-        <w:tc>
-          <w:tcPr>
-            <w:tcW w:w="0" w:type="auto"/>
-            <w:tcBorders>
-              <w:top w:val="none" w:sz="0" w:space="0" w:color="FFFFFF"/>
-              <w:left w:val="none" w:sz="0" w:space="0" w:color="FFFFFF"/>
-              <w:bottom w:val="single" w:sz="4" w:space="0" w:color="D9DEE3"/>
-              <w:right w:val="none" w:sz="0" w:space="0" w:color="FFFFFF"/>
-            </w:tcBorders>
-            <w:tcMar>
-              <w:top w:w="86" w:type="dxa"/>
-              <w:left w:w="64" w:type="dxa"/>
-              <w:bottom w:w="86" w:type="dxa"/>
-              <w:right w:w="64" w:type="dxa"/>
-            </w:tcMar>
-          </w:tcPr>
-          <w:p>
-            <w:r>
-              <w:rPr>
-                <w:rFonts w:eastAsia="Roboto"/>
-              </w:rPr>
-              <w:t>+4%</w:t>
-            </w:r>
-          </w:p>
-        </w:tc>
-        <w:tc>
-          <w:tcPr>
-            <w:tcW w:w="0" w:type="auto"/>
-            <w:tcBorders>
-              <w:top w:val="none" w:sz="0" w:space="0" w:color="FFFFFF"/>
-              <w:left w:val="none" w:sz="0" w:space="0" w:color="FFFFFF"/>
-              <w:bottom w:val="single" w:sz="4" w:space="0" w:color="D9DEE3"/>
-              <w:right w:val="none" w:sz="0" w:space="0" w:color="FFFFFF"/>
-            </w:tcBorders>
-            <w:tcMar>
-              <w:top w:w="86" w:type="dxa"/>
-              <w:left w:w="64" w:type="dxa"/>
-              <w:bottom w:w="86" w:type="dxa"/>
-              <w:right w:w="64" w:type="dxa"/>
-            </w:tcMar>
-          </w:tcPr>
-          <w:p>
-            <w:r>
-              <w:rPr>
-                <w:rFonts w:eastAsia="Roboto"/>
-              </w:rPr>
-              <w:t>42.6%</w:t>
+              <w:t>$33.70B</w:t>
+            </w:r>
+          </w:p>
+        </w:tc>
+        <w:tc>
+          <w:tcPr>
+            <w:tcW w:w="0" w:type="auto"/>
+            <w:tcBorders>
+              <w:top w:val="none" w:sz="0" w:space="0" w:color="FFFFFF"/>
+              <w:left w:val="none" w:sz="0" w:space="0" w:color="FFFFFF"/>
+              <w:bottom w:val="single" w:sz="4" w:space="0" w:color="D9DEE3"/>
+              <w:right w:val="none" w:sz="0" w:space="0" w:color="FFFFFF"/>
+            </w:tcBorders>
+            <w:tcMar>
+              <w:top w:w="86" w:type="dxa"/>
+              <w:left w:w="64" w:type="dxa"/>
+              <w:bottom w:w="86" w:type="dxa"/>
+              <w:right w:w="64" w:type="dxa"/>
+            </w:tcMar>
+          </w:tcPr>
+          <w:p>
+            <w:r>
+              <w:rPr>
+                <w:rFonts w:eastAsia="Roboto"/>
+              </w:rPr>
+              <w:t>8.1%</w:t>
+            </w:r>
+          </w:p>
+        </w:tc>
+        <w:tc>
+          <w:tcPr>
+            <w:tcW w:w="0" w:type="auto"/>
+            <w:tcBorders>
+              <w:top w:val="none" w:sz="0" w:space="0" w:color="FFFFFF"/>
+              <w:left w:val="none" w:sz="0" w:space="0" w:color="FFFFFF"/>
+              <w:bottom w:val="single" w:sz="4" w:space="0" w:color="D9DEE3"/>
+              <w:right w:val="none" w:sz="0" w:space="0" w:color="FFFFFF"/>
+            </w:tcBorders>
+            <w:tcMar>
+              <w:top w:w="86" w:type="dxa"/>
+              <w:left w:w="64" w:type="dxa"/>
+              <w:bottom w:w="86" w:type="dxa"/>
+              <w:right w:w="64" w:type="dxa"/>
+            </w:tcMar>
+          </w:tcPr>
+          <w:p>
+            <w:r>
+              <w:rPr>
+                <w:rFonts w:eastAsia="Roboto"/>
+              </w:rPr>
+              <w:t>+9.9%</w:t>
+            </w:r>
+          </w:p>
+        </w:tc>
+        <w:tc>
+          <w:tcPr>
+            <w:tcW w:w="0" w:type="auto"/>
+            <w:tcBorders>
+              <w:top w:val="none" w:sz="0" w:space="0" w:color="FFFFFF"/>
+              <w:left w:val="none" w:sz="0" w:space="0" w:color="FFFFFF"/>
+              <w:bottom w:val="single" w:sz="4" w:space="0" w:color="D9DEE3"/>
+              <w:right w:val="none" w:sz="0" w:space="0" w:color="FFFFFF"/>
+            </w:tcBorders>
+            <w:tcMar>
+              <w:top w:w="86" w:type="dxa"/>
+              <w:left w:w="64" w:type="dxa"/>
+              <w:bottom w:w="86" w:type="dxa"/>
+              <w:right w:w="64" w:type="dxa"/>
+            </w:tcMar>
+          </w:tcPr>
+          <w:p>
+            <w:r>
+              <w:rPr>
+                <w:rFonts w:eastAsia="Roboto"/>
+              </w:rPr>
+              <w:t>~43.0%</w:t>
             </w:r>
           </w:p>
         </w:tc>
@@ -7169,7 +7162,7 @@
               <w:rPr>
                 <w:rFonts w:eastAsia="Roboto"/>
               </w:rPr>
-              <w:t>$391.04B</w:t>
+              <w:t>$416.16B</w:t>
             </w:r>
           </w:p>
         </w:tc>
@@ -7219,32 +7212,32 @@
               <w:rPr>
                 <w:rFonts w:eastAsia="Roboto"/>
               </w:rPr>
-              <w:t>+2%</w:t>
-            </w:r>
-          </w:p>
-        </w:tc>
-        <w:tc>
-          <w:tcPr>
-            <w:tcW w:w="0" w:type="auto"/>
-            <w:tcBorders>
-              <w:top w:val="none" w:sz="0" w:space="0" w:color="FFFFFF"/>
-              <w:left w:val="none" w:sz="0" w:space="0" w:color="FFFFFF"/>
-              <w:bottom w:val="single" w:sz="4" w:space="0" w:color="D9DEE3"/>
-              <w:right w:val="none" w:sz="0" w:space="0" w:color="FFFFFF"/>
-            </w:tcBorders>
-            <w:tcMar>
-              <w:top w:w="86" w:type="dxa"/>
-              <w:left w:w="64" w:type="dxa"/>
-              <w:bottom w:w="86" w:type="dxa"/>
-              <w:right w:w="64" w:type="dxa"/>
-            </w:tcMar>
-          </w:tcPr>
-          <w:p>
-            <w:r>
-              <w:rPr>
-                <w:rFonts w:eastAsia="Roboto"/>
-              </w:rPr>
-              <w:t>~41% (segment-level)</w:t>
+              <w:t>+6.4%</w:t>
+            </w:r>
+          </w:p>
+        </w:tc>
+        <w:tc>
+          <w:tcPr>
+            <w:tcW w:w="0" w:type="auto"/>
+            <w:tcBorders>
+              <w:top w:val="none" w:sz="0" w:space="0" w:color="FFFFFF"/>
+              <w:left w:val="none" w:sz="0" w:space="0" w:color="FFFFFF"/>
+              <w:bottom w:val="single" w:sz="4" w:space="0" w:color="D9DEE3"/>
+              <w:right w:val="none" w:sz="0" w:space="0" w:color="FFFFFF"/>
+            </w:tcBorders>
+            <w:tcMar>
+              <w:top w:w="86" w:type="dxa"/>
+              <w:left w:w="64" w:type="dxa"/>
+              <w:bottom w:w="86" w:type="dxa"/>
+              <w:right w:w="64" w:type="dxa"/>
+            </w:tcMar>
+          </w:tcPr>
+          <w:p>
+            <w:r>
+              <w:rPr>
+                <w:rFonts w:eastAsia="Roboto"/>
+              </w:rPr>
+              <w:t>~32.0% (consolidated)</w:t>
             </w:r>
           </w:p>
         </w:tc>
@@ -7263,21 +7256,19 @@
         <w:rPr>
           <w:rFonts w:eastAsia="Roboto"/>
         </w:rPr>
-        <w:t xml:space="preserve">Geographic mix tells the true story of Apple's FY24-25: Americas and Europe held up (+3% / +7%), Japan hit a 2021-2025 high at 49.7% segment operating margin (highest of any region), and Greater China suffered its second straight contraction year (-8% FY24, -4% FY25). Yet the F1Q26 print shattered the bear narrative: Greater China flipped to +38% YoY on iPhone 17 demand + consumer subsidies, a swing of nearly 50pp vs the FY25 </w:t>
+        <w:t>Geographic mix for FY25 shows broad-based growth outside China: Japan led at +14.6% YoY to $28.70B, followed by Europe +9.6% to $111.03B and Rest of Asia Pacific +9.9% to $33.70B. Americas grew +6.8% to $178.35B, maintaining its 43% dominance. Greater China was the only contracting region at -3.8% YoY to $64.38B, its second consecutive year of decline — though the F1Q26 +38% surge signals a potential inflection. The geographic diversification story is strengthening: non-China international revenue grew ~10% and now comprises 41.7% of total revenue, reducing single-market concentration risk.</w:t>
       </w:r>
       <w:proofErr w:type="gramStart"/>
       <w:r>
         <w:rPr>
           <w:rFonts w:eastAsia="Roboto"/>
         </w:rPr>
-        <w:t>run-rate</w:t>
       </w:r>
       <w:proofErr w:type="gramEnd"/>
       <w:r>
         <w:rPr>
           <w:rFonts w:eastAsia="Roboto"/>
         </w:rPr>
-        <w:t>. Japan's 49.7% operating margin vs Greater China's 40.5% illustrates the margin-dilutive nature of China promotions, and it is exactly that dynamic that the bear case requires to persist structurally.</w:t>
       </w:r>
     </w:p>
     <w:p>

</xml_diff>